<commit_message>
Added scripts to analyse the RT variable and to find new features with correlation to the failure of CATIE
</commit_message>
<xml_diff>
--- a/תיעוד הפרוייקט.docx
+++ b/תיעוד הפרוייקט.docx
@@ -97,14 +97,14 @@
           <w:rFonts w:ascii="Heebo" w:hAnsi="Heebo"/>
           <w:rtl/>
         </w:rPr>
-        <w:t>ה"בנצ'מרק</w:t>
+        <w:t>הבנצ'מרק</w:t>
       </w:r>
       <w:proofErr w:type="spellEnd"/>
       <w:r>
         <w:rPr>
           <w:rFonts w:ascii="Heebo" w:hAnsi="Heebo"/>
         </w:rPr>
-        <w:t xml:space="preserve">" (Benchmark) </w:t>
+        <w:t xml:space="preserve"> (Benchmark) </w:t>
       </w:r>
       <w:r>
         <w:rPr>
@@ -693,7 +693,6 @@
         </w:rPr>
         <w:t xml:space="preserve">והסרנו נבדקים </w:t>
       </w:r>
-      <w:proofErr w:type="spellStart"/>
       <w:r>
         <w:rPr>
           <w:rFonts w:hint="cs"/>
@@ -701,7 +700,6 @@
         </w:rPr>
         <w:t>בעייתים</w:t>
       </w:r>
-      <w:proofErr w:type="spellEnd"/>
       <w:r>
         <w:rPr>
           <w:rFonts w:hint="cs"/>
@@ -1625,7 +1623,526 @@
           <w:rtl/>
         </w:rPr>
         <w:lastRenderedPageBreak/>
-        <w:t xml:space="preserve">שבוע 3 - </w:t>
+        <w:t xml:space="preserve">שבוע 3 </w:t>
+      </w:r>
+      <w:r>
+        <w:rPr>
+          <w:rtl/>
+        </w:rPr>
+        <w:t>–</w:t>
+      </w:r>
+      <w:r>
+        <w:rPr>
+          <w:rFonts w:hint="cs"/>
+          <w:rtl/>
+        </w:rPr>
+        <w:t xml:space="preserve"> מציאת קורלציות והפקת גרפים</w:t>
+      </w:r>
+    </w:p>
+    <w:p>
+      <w:pPr>
+        <w:rPr>
+          <w:rtl/>
+        </w:rPr>
+      </w:pPr>
+      <w:r>
+        <w:rPr>
+          <w:rFonts w:hint="cs"/>
+          <w:rtl/>
+        </w:rPr>
+        <w:t xml:space="preserve">הכנו סקריפט </w:t>
+      </w:r>
+      <w:r>
+        <w:rPr>
+          <w:rFonts w:hint="cs"/>
+          <w:rtl/>
+        </w:rPr>
+        <w:t xml:space="preserve">שחישב לכל בחירה של כל נבדק מסט ה </w:t>
+      </w:r>
+      <w:r>
+        <w:t>EDA</w:t>
+      </w:r>
+      <w:r>
+        <w:rPr>
+          <w:rFonts w:hint="cs"/>
+          <w:rtl/>
+        </w:rPr>
+        <w:t xml:space="preserve"> את ההסתברות ש </w:t>
+      </w:r>
+      <w:r>
+        <w:t>CATIE</w:t>
+      </w:r>
+      <w:r>
+        <w:rPr>
+          <w:rFonts w:hint="cs"/>
+          <w:rtl/>
+        </w:rPr>
+        <w:t xml:space="preserve"> העניק לבחירה שהתקבלה (הסתברות נמוכה = </w:t>
+      </w:r>
+      <w:r>
+        <w:t>CATIE</w:t>
+      </w:r>
+      <w:r>
+        <w:rPr>
+          <w:rFonts w:hint="cs"/>
+          <w:rtl/>
+        </w:rPr>
+        <w:t xml:space="preserve"> היה מופתע מהבחירה</w:t>
+      </w:r>
+      <w:r>
+        <w:rPr>
+          <w:rFonts w:hint="cs"/>
+          <w:rtl/>
+        </w:rPr>
+        <w:t xml:space="preserve"> וגבוהה = </w:t>
+      </w:r>
+      <w:r>
+        <w:t>CATIE</w:t>
+      </w:r>
+      <w:r>
+        <w:rPr>
+          <w:rFonts w:hint="cs"/>
+          <w:rtl/>
+        </w:rPr>
+        <w:t xml:space="preserve"> חזה את הבחירה)</w:t>
+      </w:r>
+      <w:r>
+        <w:rPr>
+          <w:rFonts w:hint="cs"/>
+          <w:rtl/>
+        </w:rPr>
+        <w:t xml:space="preserve">. הסקריפט נכתב ב </w:t>
+      </w:r>
+      <w:proofErr w:type="spellStart"/>
+      <w:r>
+        <w:t>Matlab</w:t>
+      </w:r>
+      <w:proofErr w:type="spellEnd"/>
+      <w:r>
+        <w:rPr>
+          <w:rFonts w:hint="cs"/>
+          <w:rtl/>
+        </w:rPr>
+        <w:t xml:space="preserve"> והשתמשנו בו בדיוק באותן הפונקציות</w:t>
+      </w:r>
+      <w:r>
+        <w:rPr>
+          <w:rFonts w:hint="cs"/>
+          <w:rtl/>
+        </w:rPr>
+        <w:t xml:space="preserve"> מקוד המקור. וידאנו את תקינות המידע שהתקבל.</w:t>
+      </w:r>
+    </w:p>
+    <w:p>
+      <w:r>
+        <w:rPr>
+          <w:rFonts w:hint="cs"/>
+          <w:rtl/>
+        </w:rPr>
+        <w:t xml:space="preserve">לאחר מכן הכנו </w:t>
+      </w:r>
+      <w:r>
+        <w:rPr>
+          <w:rFonts w:hint="cs"/>
+          <w:rtl/>
+        </w:rPr>
+        <w:t>סקריפט נוסף שמטרתו הייתה בהינתן המידע שיש לנו על זמני התגובה</w:t>
+      </w:r>
+      <w:r>
+        <w:rPr>
+          <w:rFonts w:hint="cs"/>
+          <w:rtl/>
+        </w:rPr>
+        <w:t xml:space="preserve"> ו</w:t>
+      </w:r>
+      <w:r>
+        <w:rPr>
+          <w:rFonts w:hint="cs"/>
+          <w:rtl/>
+        </w:rPr>
+        <w:t xml:space="preserve">היחס של זמני התגובה לכל נבדק (לכל נבדק יש עמודה של </w:t>
+      </w:r>
+      <w:r>
+        <w:t>RT</w:t>
+      </w:r>
+      <w:r>
+        <w:rPr>
+          <w:rFonts w:hint="cs"/>
+          <w:rtl/>
+        </w:rPr>
+        <w:t xml:space="preserve"> מנורמל ביחס לכלל ה </w:t>
+      </w:r>
+      <w:r>
+        <w:t>RT</w:t>
+      </w:r>
+      <w:r>
+        <w:rPr>
+          <w:rFonts w:hint="cs"/>
+          <w:rtl/>
+        </w:rPr>
+        <w:t xml:space="preserve"> שלו)</w:t>
+      </w:r>
+      <w:r>
+        <w:rPr>
+          <w:rFonts w:hint="cs"/>
+          <w:rtl/>
+        </w:rPr>
+        <w:t xml:space="preserve"> והמידע אודות הערכת ההסתברות של </w:t>
+      </w:r>
+      <w:r>
+        <w:t>CATIE</w:t>
+      </w:r>
+      <w:r>
+        <w:rPr>
+          <w:rFonts w:hint="cs"/>
+          <w:rtl/>
+        </w:rPr>
+        <w:t xml:space="preserve"> לבדוק את </w:t>
+      </w:r>
+      <w:r>
+        <w:rPr>
+          <w:rFonts w:hint="cs"/>
+          <w:rtl/>
+        </w:rPr>
+        <w:t>ההשערות שלנו.</w:t>
+      </w:r>
+    </w:p>
+    <w:p>
+      <w:pPr>
+        <w:rPr>
+          <w:rtl/>
+        </w:rPr>
+      </w:pPr>
+      <w:r>
+        <w:rPr>
+          <w:rFonts w:hint="cs"/>
+          <w:noProof/>
+          <w:rtl/>
+          <w:lang w:val="he-IL"/>
+        </w:rPr>
+        <w:drawing>
+          <wp:anchor distT="0" distB="0" distL="114300" distR="114300" simplePos="0" relativeHeight="251662336" behindDoc="0" locked="0" layoutInCell="1" allowOverlap="1" wp14:anchorId="64E54597" wp14:editId="6684E094">
+            <wp:simplePos x="0" y="0"/>
+            <wp:positionH relativeFrom="column">
+              <wp:posOffset>-911176</wp:posOffset>
+            </wp:positionH>
+            <wp:positionV relativeFrom="paragraph">
+              <wp:posOffset>2757610</wp:posOffset>
+            </wp:positionV>
+            <wp:extent cx="3255010" cy="1783715"/>
+            <wp:effectExtent l="0" t="0" r="2540" b="6985"/>
+            <wp:wrapTopAndBottom/>
+            <wp:docPr id="181990220" name="תמונה 5"/>
+            <wp:cNvGraphicFramePr>
+              <a:graphicFrameLocks xmlns:a="http://schemas.openxmlformats.org/drawingml/2006/main" noChangeAspect="1"/>
+            </wp:cNvGraphicFramePr>
+            <a:graphic xmlns:a="http://schemas.openxmlformats.org/drawingml/2006/main">
+              <a:graphicData uri="http://schemas.openxmlformats.org/drawingml/2006/picture">
+                <pic:pic xmlns:pic="http://schemas.openxmlformats.org/drawingml/2006/picture">
+                  <pic:nvPicPr>
+                    <pic:cNvPr id="181990220" name="תמונה 181990220"/>
+                    <pic:cNvPicPr/>
+                  </pic:nvPicPr>
+                  <pic:blipFill>
+                    <a:blip r:embed="rId5" cstate="print">
+                      <a:extLst>
+                        <a:ext uri="{28A0092B-C50C-407E-A947-70E740481C1C}">
+                          <a14:useLocalDpi xmlns:a14="http://schemas.microsoft.com/office/drawing/2010/main" val="0"/>
+                        </a:ext>
+                      </a:extLst>
+                    </a:blip>
+                    <a:stretch>
+                      <a:fillRect/>
+                    </a:stretch>
+                  </pic:blipFill>
+                  <pic:spPr>
+                    <a:xfrm>
+                      <a:off x="0" y="0"/>
+                      <a:ext cx="3255010" cy="1783715"/>
+                    </a:xfrm>
+                    <a:prstGeom prst="rect">
+                      <a:avLst/>
+                    </a:prstGeom>
+                  </pic:spPr>
+                </pic:pic>
+              </a:graphicData>
+            </a:graphic>
+            <wp14:sizeRelH relativeFrom="page">
+              <wp14:pctWidth>0</wp14:pctWidth>
+            </wp14:sizeRelH>
+            <wp14:sizeRelV relativeFrom="page">
+              <wp14:pctHeight>0</wp14:pctHeight>
+            </wp14:sizeRelV>
+          </wp:anchor>
+        </w:drawing>
+      </w:r>
+      <w:r>
+        <w:rPr>
+          <w:rFonts w:hint="cs"/>
+          <w:noProof/>
+          <w:rtl/>
+          <w:lang w:val="he-IL"/>
+        </w:rPr>
+        <w:drawing>
+          <wp:anchor distT="0" distB="0" distL="114300" distR="114300" simplePos="0" relativeHeight="251661312" behindDoc="0" locked="0" layoutInCell="1" allowOverlap="1" wp14:anchorId="6F34E9D4" wp14:editId="7B28C7C6">
+            <wp:simplePos x="0" y="0"/>
+            <wp:positionH relativeFrom="column">
+              <wp:posOffset>1213046</wp:posOffset>
+            </wp:positionH>
+            <wp:positionV relativeFrom="paragraph">
+              <wp:posOffset>4703250</wp:posOffset>
+            </wp:positionV>
+            <wp:extent cx="2903013" cy="1800665"/>
+            <wp:effectExtent l="0" t="0" r="0" b="9525"/>
+            <wp:wrapTopAndBottom/>
+            <wp:docPr id="238699722" name="תמונה 3"/>
+            <wp:cNvGraphicFramePr>
+              <a:graphicFrameLocks xmlns:a="http://schemas.openxmlformats.org/drawingml/2006/main" noChangeAspect="1"/>
+            </wp:cNvGraphicFramePr>
+            <a:graphic xmlns:a="http://schemas.openxmlformats.org/drawingml/2006/main">
+              <a:graphicData uri="http://schemas.openxmlformats.org/drawingml/2006/picture">
+                <pic:pic xmlns:pic="http://schemas.openxmlformats.org/drawingml/2006/picture">
+                  <pic:nvPicPr>
+                    <pic:cNvPr id="238699722" name="תמונה 238699722"/>
+                    <pic:cNvPicPr/>
+                  </pic:nvPicPr>
+                  <pic:blipFill>
+                    <a:blip r:embed="rId6" cstate="print">
+                      <a:extLst>
+                        <a:ext uri="{28A0092B-C50C-407E-A947-70E740481C1C}">
+                          <a14:useLocalDpi xmlns:a14="http://schemas.microsoft.com/office/drawing/2010/main" val="0"/>
+                        </a:ext>
+                      </a:extLst>
+                    </a:blip>
+                    <a:stretch>
+                      <a:fillRect/>
+                    </a:stretch>
+                  </pic:blipFill>
+                  <pic:spPr>
+                    <a:xfrm>
+                      <a:off x="0" y="0"/>
+                      <a:ext cx="2903013" cy="1800665"/>
+                    </a:xfrm>
+                    <a:prstGeom prst="rect">
+                      <a:avLst/>
+                    </a:prstGeom>
+                  </pic:spPr>
+                </pic:pic>
+              </a:graphicData>
+            </a:graphic>
+            <wp14:sizeRelH relativeFrom="page">
+              <wp14:pctWidth>0</wp14:pctWidth>
+            </wp14:sizeRelH>
+            <wp14:sizeRelV relativeFrom="page">
+              <wp14:pctHeight>0</wp14:pctHeight>
+            </wp14:sizeRelV>
+          </wp:anchor>
+        </w:drawing>
+      </w:r>
+      <w:r>
+        <w:rPr>
+          <w:rFonts w:hint="cs"/>
+          <w:noProof/>
+          <w:rtl/>
+          <w:lang w:val="he-IL"/>
+        </w:rPr>
+        <w:drawing>
+          <wp:anchor distT="0" distB="0" distL="114300" distR="114300" simplePos="0" relativeHeight="251660288" behindDoc="0" locked="0" layoutInCell="1" allowOverlap="1" wp14:anchorId="1F6503EA" wp14:editId="39332BEC">
+            <wp:simplePos x="0" y="0"/>
+            <wp:positionH relativeFrom="column">
+              <wp:posOffset>2493254</wp:posOffset>
+            </wp:positionH>
+            <wp:positionV relativeFrom="paragraph">
+              <wp:posOffset>2657036</wp:posOffset>
+            </wp:positionV>
+            <wp:extent cx="3642360" cy="2002155"/>
+            <wp:effectExtent l="0" t="0" r="0" b="0"/>
+            <wp:wrapTopAndBottom/>
+            <wp:docPr id="1305123681" name="תמונה 4"/>
+            <wp:cNvGraphicFramePr>
+              <a:graphicFrameLocks xmlns:a="http://schemas.openxmlformats.org/drawingml/2006/main" noChangeAspect="1"/>
+            </wp:cNvGraphicFramePr>
+            <a:graphic xmlns:a="http://schemas.openxmlformats.org/drawingml/2006/main">
+              <a:graphicData uri="http://schemas.openxmlformats.org/drawingml/2006/picture">
+                <pic:pic xmlns:pic="http://schemas.openxmlformats.org/drawingml/2006/picture">
+                  <pic:nvPicPr>
+                    <pic:cNvPr id="1305123681" name="תמונה 1305123681"/>
+                    <pic:cNvPicPr/>
+                  </pic:nvPicPr>
+                  <pic:blipFill>
+                    <a:blip r:embed="rId7" cstate="print">
+                      <a:extLst>
+                        <a:ext uri="{28A0092B-C50C-407E-A947-70E740481C1C}">
+                          <a14:useLocalDpi xmlns:a14="http://schemas.microsoft.com/office/drawing/2010/main" val="0"/>
+                        </a:ext>
+                      </a:extLst>
+                    </a:blip>
+                    <a:stretch>
+                      <a:fillRect/>
+                    </a:stretch>
+                  </pic:blipFill>
+                  <pic:spPr>
+                    <a:xfrm>
+                      <a:off x="0" y="0"/>
+                      <a:ext cx="3642360" cy="2002155"/>
+                    </a:xfrm>
+                    <a:prstGeom prst="rect">
+                      <a:avLst/>
+                    </a:prstGeom>
+                  </pic:spPr>
+                </pic:pic>
+              </a:graphicData>
+            </a:graphic>
+            <wp14:sizeRelH relativeFrom="page">
+              <wp14:pctWidth>0</wp14:pctWidth>
+            </wp14:sizeRelH>
+            <wp14:sizeRelV relativeFrom="page">
+              <wp14:pctHeight>0</wp14:pctHeight>
+            </wp14:sizeRelV>
+          </wp:anchor>
+        </w:drawing>
+      </w:r>
+      <w:r>
+        <w:rPr>
+          <w:rFonts w:hint="cs"/>
+          <w:noProof/>
+          <w:rtl/>
+          <w:lang w:val="he-IL"/>
+        </w:rPr>
+        <w:drawing>
+          <wp:anchor distT="0" distB="0" distL="114300" distR="114300" simplePos="0" relativeHeight="251659264" behindDoc="0" locked="0" layoutInCell="1" allowOverlap="1" wp14:anchorId="0D21BCE8" wp14:editId="2557ED31">
+            <wp:simplePos x="0" y="0"/>
+            <wp:positionH relativeFrom="column">
+              <wp:posOffset>-610039</wp:posOffset>
+            </wp:positionH>
+            <wp:positionV relativeFrom="paragraph">
+              <wp:posOffset>477471</wp:posOffset>
+            </wp:positionV>
+            <wp:extent cx="2988512" cy="1856936"/>
+            <wp:effectExtent l="0" t="0" r="2540" b="0"/>
+            <wp:wrapTopAndBottom/>
+            <wp:docPr id="1654519753" name="תמונה 2"/>
+            <wp:cNvGraphicFramePr>
+              <a:graphicFrameLocks xmlns:a="http://schemas.openxmlformats.org/drawingml/2006/main" noChangeAspect="1"/>
+            </wp:cNvGraphicFramePr>
+            <a:graphic xmlns:a="http://schemas.openxmlformats.org/drawingml/2006/main">
+              <a:graphicData uri="http://schemas.openxmlformats.org/drawingml/2006/picture">
+                <pic:pic xmlns:pic="http://schemas.openxmlformats.org/drawingml/2006/picture">
+                  <pic:nvPicPr>
+                    <pic:cNvPr id="1654519753" name="תמונה 1654519753"/>
+                    <pic:cNvPicPr/>
+                  </pic:nvPicPr>
+                  <pic:blipFill>
+                    <a:blip r:embed="rId8" cstate="print">
+                      <a:extLst>
+                        <a:ext uri="{28A0092B-C50C-407E-A947-70E740481C1C}">
+                          <a14:useLocalDpi xmlns:a14="http://schemas.microsoft.com/office/drawing/2010/main" val="0"/>
+                        </a:ext>
+                      </a:extLst>
+                    </a:blip>
+                    <a:stretch>
+                      <a:fillRect/>
+                    </a:stretch>
+                  </pic:blipFill>
+                  <pic:spPr>
+                    <a:xfrm>
+                      <a:off x="0" y="0"/>
+                      <a:ext cx="2988512" cy="1856936"/>
+                    </a:xfrm>
+                    <a:prstGeom prst="rect">
+                      <a:avLst/>
+                    </a:prstGeom>
+                  </pic:spPr>
+                </pic:pic>
+              </a:graphicData>
+            </a:graphic>
+          </wp:anchor>
+        </w:drawing>
+      </w:r>
+      <w:r>
+        <w:rPr>
+          <w:rFonts w:hint="cs"/>
+          <w:noProof/>
+          <w:rtl/>
+          <w:lang w:val="he-IL"/>
+        </w:rPr>
+        <w:drawing>
+          <wp:anchor distT="0" distB="0" distL="114300" distR="114300" simplePos="0" relativeHeight="251658240" behindDoc="0" locked="0" layoutInCell="1" allowOverlap="1" wp14:anchorId="4D9F89D0" wp14:editId="0157EE27">
+            <wp:simplePos x="0" y="0"/>
+            <wp:positionH relativeFrom="column">
+              <wp:posOffset>2802743</wp:posOffset>
+            </wp:positionH>
+            <wp:positionV relativeFrom="paragraph">
+              <wp:posOffset>254635</wp:posOffset>
+            </wp:positionV>
+            <wp:extent cx="3269664" cy="2304826"/>
+            <wp:effectExtent l="0" t="0" r="6985" b="635"/>
+            <wp:wrapTopAndBottom/>
+            <wp:docPr id="911720389" name="תמונה 1"/>
+            <wp:cNvGraphicFramePr>
+              <a:graphicFrameLocks xmlns:a="http://schemas.openxmlformats.org/drawingml/2006/main" noChangeAspect="1"/>
+            </wp:cNvGraphicFramePr>
+            <a:graphic xmlns:a="http://schemas.openxmlformats.org/drawingml/2006/main">
+              <a:graphicData uri="http://schemas.openxmlformats.org/drawingml/2006/picture">
+                <pic:pic xmlns:pic="http://schemas.openxmlformats.org/drawingml/2006/picture">
+                  <pic:nvPicPr>
+                    <pic:cNvPr id="911720389" name="תמונה 911720389"/>
+                    <pic:cNvPicPr/>
+                  </pic:nvPicPr>
+                  <pic:blipFill>
+                    <a:blip r:embed="rId9" cstate="print">
+                      <a:extLst>
+                        <a:ext uri="{28A0092B-C50C-407E-A947-70E740481C1C}">
+                          <a14:useLocalDpi xmlns:a14="http://schemas.microsoft.com/office/drawing/2010/main" val="0"/>
+                        </a:ext>
+                      </a:extLst>
+                    </a:blip>
+                    <a:stretch>
+                      <a:fillRect/>
+                    </a:stretch>
+                  </pic:blipFill>
+                  <pic:spPr>
+                    <a:xfrm>
+                      <a:off x="0" y="0"/>
+                      <a:ext cx="3269664" cy="2304826"/>
+                    </a:xfrm>
+                    <a:prstGeom prst="rect">
+                      <a:avLst/>
+                    </a:prstGeom>
+                  </pic:spPr>
+                </pic:pic>
+              </a:graphicData>
+            </a:graphic>
+            <wp14:sizeRelH relativeFrom="page">
+              <wp14:pctWidth>0</wp14:pctWidth>
+            </wp14:sizeRelH>
+            <wp14:sizeRelV relativeFrom="page">
+              <wp14:pctHeight>0</wp14:pctHeight>
+            </wp14:sizeRelV>
+          </wp:anchor>
+        </w:drawing>
+      </w:r>
+      <w:r>
+        <w:rPr>
+          <w:rFonts w:hint="cs"/>
+          <w:rtl/>
+        </w:rPr>
+        <w:t>גרפים שקיבלנו:</w:t>
+      </w:r>
+    </w:p>
+    <w:p>
+      <w:pPr>
+        <w:rPr>
+          <w:rtl/>
+        </w:rPr>
+      </w:pPr>
+      <w:r>
+        <w:rPr>
+          <w:rFonts w:hint="cs"/>
+          <w:rtl/>
+        </w:rPr>
+        <w:lastRenderedPageBreak/>
+        <w:t>מסקנות מהגרפים:</w:t>
       </w:r>
     </w:p>
     <w:p>

</xml_diff>